<commit_message>
updated cv after it pro
</commit_message>
<xml_diff>
--- a/files/Marios_Raspopoulos - Accademic CV.docx
+++ b/files/Marios_Raspopoulos - Accademic CV.docx
@@ -2615,6 +2615,8 @@
       <w:r>
         <w:rPr>
           <w:rFonts w:ascii="Calibri Light" w:hAnsi="Calibri Light" w:cs="Calibri Light"/>
+          <w:b/>
+          <w:bCs/>
           <w:color w:val="000000" w:themeColor="text1"/>
         </w:rPr>
         <w:t xml:space="preserve">Mr. </w:t>
@@ -2622,9 +2624,18 @@
       <w:r>
         <w:rPr>
           <w:rFonts w:ascii="Calibri Light" w:hAnsi="Calibri Light" w:cs="Calibri Light"/>
-          <w:color w:val="000000" w:themeColor="text1"/>
-        </w:rPr>
-        <w:t xml:space="preserve">Theodosis Pasiali </w:t>
+          <w:b/>
+          <w:bCs/>
+          <w:color w:val="000000" w:themeColor="text1"/>
+        </w:rPr>
+        <w:t>Theodosis Pasiali</w:t>
+      </w:r>
+      <w:r>
+        <w:rPr>
+          <w:rFonts w:ascii="Calibri Light" w:hAnsi="Calibri Light" w:cs="Calibri Light"/>
+          <w:color w:val="000000" w:themeColor="text1"/>
+        </w:rPr>
+        <w:t xml:space="preserve"> </w:t>
       </w:r>
       <w:proofErr w:type="gramStart"/>
       <w:r>
@@ -2695,6 +2706,8 @@
       <w:r>
         <w:rPr>
           <w:rFonts w:ascii="Calibri Light" w:hAnsi="Calibri Light" w:cs="Calibri Light"/>
+          <w:b/>
+          <w:bCs/>
           <w:color w:val="000000" w:themeColor="text1"/>
         </w:rPr>
         <w:t>Mrs. Constantina Stavrou</w:t>
@@ -2738,6 +2751,8 @@
       <w:r>
         <w:rPr>
           <w:rFonts w:ascii="Calibri Light" w:hAnsi="Calibri Light" w:cs="Calibri Light"/>
+          <w:b/>
+          <w:bCs/>
           <w:color w:val="000000" w:themeColor="text1"/>
         </w:rPr>
         <w:t xml:space="preserve">Dr </w:t>
@@ -2745,9 +2760,20 @@
       <w:r>
         <w:rPr>
           <w:rFonts w:ascii="Calibri Light" w:hAnsi="Calibri Light" w:cs="Calibri Light"/>
+          <w:b/>
+          <w:bCs/>
           <w:color w:val="000000" w:themeColor="text1"/>
         </w:rPr>
         <w:t>Andrey Sesyuk</w:t>
+      </w:r>
+      <w:r>
+        <w:rPr>
+          <w:rFonts w:ascii="Calibri Light" w:hAnsi="Calibri Light" w:cs="Calibri Light"/>
+          <w:b/>
+          <w:bCs/>
+          <w:color w:val="000000" w:themeColor="text1"/>
+        </w:rPr>
+        <w:t xml:space="preserve"> [Completed]</w:t>
       </w:r>
       <w:r>
         <w:rPr>
@@ -16586,6 +16612,94 @@
           <w:rFonts w:ascii="Calibri Light" w:hAnsi="Calibri Light" w:cs="Calibri Light"/>
           <w:color w:val="000000" w:themeColor="text1"/>
         </w:rPr>
+        <w:t xml:space="preserve">L. </w:t>
+      </w:r>
+      <w:proofErr w:type="spellStart"/>
+      <w:r>
+        <w:rPr>
+          <w:rFonts w:ascii="Calibri Light" w:hAnsi="Calibri Light" w:cs="Calibri Light"/>
+          <w:color w:val="000000" w:themeColor="text1"/>
+        </w:rPr>
+        <w:t>Nisiotis</w:t>
+      </w:r>
+      <w:proofErr w:type="spellEnd"/>
+      <w:r>
+        <w:rPr>
+          <w:rFonts w:ascii="Calibri Light" w:hAnsi="Calibri Light" w:cs="Calibri Light"/>
+          <w:color w:val="000000" w:themeColor="text1"/>
+        </w:rPr>
+        <w:t xml:space="preserve">, A. Anikina and </w:t>
+      </w:r>
+      <w:r>
+        <w:rPr>
+          <w:rFonts w:ascii="Calibri Light" w:hAnsi="Calibri Light" w:cs="Calibri Light"/>
+          <w:b/>
+          <w:bCs/>
+          <w:color w:val="000000" w:themeColor="text1"/>
+        </w:rPr>
+        <w:t>M. Raspopoulos</w:t>
+      </w:r>
+      <w:r>
+        <w:rPr>
+          <w:rFonts w:ascii="Calibri Light" w:hAnsi="Calibri Light" w:cs="Calibri Light"/>
+          <w:color w:val="000000" w:themeColor="text1"/>
+        </w:rPr>
+        <w:t xml:space="preserve">, “The Development of a Virtual-Reality Wireless Signal Propagation Simulator in Unreal Engine: A Device and Performance Testing,” in IT Professional, vol. 28, no. 1, pp. 44-50, Jan.-Feb. </w:t>
+      </w:r>
+      <w:r>
+        <w:rPr>
+          <w:rFonts w:ascii="Calibri Light" w:hAnsi="Calibri Light" w:cs="Calibri Light"/>
+          <w:b/>
+          <w:bCs/>
+          <w:color w:val="000000" w:themeColor="text1"/>
+        </w:rPr>
+        <w:t>2026</w:t>
+      </w:r>
+      <w:r>
+        <w:rPr>
+          <w:rFonts w:ascii="Calibri Light" w:hAnsi="Calibri Light" w:cs="Calibri Light"/>
+          <w:color w:val="000000" w:themeColor="text1"/>
+        </w:rPr>
+        <w:t xml:space="preserve">, </w:t>
+      </w:r>
+      <w:proofErr w:type="spellStart"/>
+      <w:r>
+        <w:rPr>
+          <w:rFonts w:ascii="Calibri Light" w:hAnsi="Calibri Light" w:cs="Calibri Light"/>
+          <w:color w:val="000000" w:themeColor="text1"/>
+        </w:rPr>
+        <w:t>doi</w:t>
+      </w:r>
+      <w:proofErr w:type="spellEnd"/>
+      <w:r>
+        <w:rPr>
+          <w:rFonts w:ascii="Calibri Light" w:hAnsi="Calibri Light" w:cs="Calibri Light"/>
+          <w:color w:val="000000" w:themeColor="text1"/>
+        </w:rPr>
+        <w:t>: 10.1109/MITP.2024.3503434.</w:t>
+      </w:r>
+    </w:p>
+    <w:p>
+      <w:pPr>
+        <w:pStyle w:val="ListParagraph"/>
+        <w:numPr>
+          <w:ilvl w:val="0"/>
+          <w:numId w:val="28"/>
+        </w:numPr>
+        <w:spacing w:after="120"/>
+        <w:ind w:left="709" w:hanging="567"/>
+        <w:contextualSpacing w:val="0"/>
+        <w:jc w:val="both"/>
+        <w:rPr>
+          <w:rFonts w:ascii="Calibri Light" w:hAnsi="Calibri Light" w:cs="Calibri Light"/>
+          <w:color w:val="000000" w:themeColor="text1"/>
+        </w:rPr>
+      </w:pPr>
+      <w:r>
+        <w:rPr>
+          <w:rFonts w:ascii="Calibri Light" w:hAnsi="Calibri Light" w:cs="Calibri Light"/>
+          <w:color w:val="000000" w:themeColor="text1"/>
+        </w:rPr>
         <w:t xml:space="preserve">Ioannou, I.; Vassiliou, V.; </w:t>
       </w:r>
       <w:r>
@@ -16765,81 +16879,6 @@
           <w:t>https://doi.org/10.1049/cmu2.70096</w:t>
         </w:r>
       </w:hyperlink>
-    </w:p>
-    <w:p>
-      <w:pPr>
-        <w:pStyle w:val="ListParagraph"/>
-        <w:numPr>
-          <w:ilvl w:val="0"/>
-          <w:numId w:val="28"/>
-        </w:numPr>
-        <w:spacing w:after="120"/>
-        <w:ind w:left="709" w:hanging="567"/>
-        <w:contextualSpacing w:val="0"/>
-        <w:jc w:val="both"/>
-        <w:rPr>
-          <w:rFonts w:ascii="Calibri Light" w:hAnsi="Calibri Light" w:cs="Calibri Light"/>
-          <w:color w:val="000000" w:themeColor="text1"/>
-        </w:rPr>
-      </w:pPr>
-      <w:r>
-        <w:rPr>
-          <w:rFonts w:ascii="Calibri Light" w:hAnsi="Calibri Light" w:cs="Calibri Light"/>
-          <w:color w:val="000000" w:themeColor="text1"/>
-        </w:rPr>
-        <w:t>L. Nisiotis, A. Anikina</w:t>
-      </w:r>
-      <w:r>
-        <w:rPr>
-          <w:rFonts w:ascii="Calibri Light" w:hAnsi="Calibri Light" w:cs="Calibri Light"/>
-          <w:color w:val="000000" w:themeColor="text1"/>
-        </w:rPr>
-        <w:t xml:space="preserve"> and</w:t>
-      </w:r>
-      <w:r>
-        <w:rPr>
-          <w:rFonts w:ascii="Calibri Light" w:hAnsi="Calibri Light" w:cs="Calibri Light"/>
-          <w:color w:val="000000" w:themeColor="text1"/>
-        </w:rPr>
-        <w:t xml:space="preserve"> </w:t>
-      </w:r>
-      <w:r>
-        <w:rPr>
-          <w:rFonts w:ascii="Calibri Light" w:hAnsi="Calibri Light" w:cs="Calibri Light"/>
-          <w:b/>
-          <w:bCs/>
-          <w:color w:val="000000" w:themeColor="text1"/>
-        </w:rPr>
-        <w:t>M. Raspopoulos</w:t>
-      </w:r>
-      <w:r>
-        <w:rPr>
-          <w:rFonts w:ascii="Calibri Light" w:hAnsi="Calibri Light" w:cs="Calibri Light"/>
-          <w:color w:val="000000" w:themeColor="text1"/>
-        </w:rPr>
-        <w:t>, "</w:t>
-      </w:r>
-      <w:r>
-        <w:rPr>
-          <w:rFonts w:ascii="Calibri Light" w:hAnsi="Calibri Light" w:cs="Calibri Light"/>
-          <w:color w:val="000000" w:themeColor="text1"/>
-        </w:rPr>
-        <w:t>The Development of a VR Wireless Signal Propagation Simulator in Unreal Engine. A Device and Performance Testing</w:t>
-      </w:r>
-      <w:r>
-        <w:rPr>
-          <w:rFonts w:ascii="Calibri Light" w:hAnsi="Calibri Light" w:cs="Calibri Light"/>
-          <w:color w:val="000000" w:themeColor="text1"/>
-        </w:rPr>
-        <w:t>," in IT Professional</w:t>
-      </w:r>
-      <w:r>
-        <w:rPr>
-          <w:rFonts w:ascii="Calibri Light" w:hAnsi="Calibri Light" w:cs="Calibri Light"/>
-          <w:color w:val="000000" w:themeColor="text1"/>
-        </w:rPr>
-        <w:t xml:space="preserve"> [In Press]</w:t>
-      </w:r>
     </w:p>
     <w:p>
       <w:pPr>

</xml_diff>